<commit_message>
v2.1: Killer Disks (K-DISKS), places rise from Avila on, walking retro price
- Killer Drives/HDD renamed Killer Disks (K-DISKS on the display, D)ISK in
  the buy menu); hackers prepare daemons, endless loops ... on them
- places may break free once place 5 (Avila) or higher was won (was 6)
- retro price: 750 at the start, +0..4 x 50 after every fight,
  -0..4 x 50 after every sale of retro stuff, never below 250
Program 5704 bytes; new recording, instructions and README.

Co-Authored-By: Claude Opus 5.5 <noreply@anthropic.com>
Claude-Session: https://claude.ai/code/session_014MnrG7cc1Hws3poqmcDFnM
</commit_message>
<xml_diff>
--- a/instructions_v2.1.docx
+++ b/instructions_v2.1.docx
@@ -206,7 +206,7 @@
         <w:rPr>
           <w:lang w:val="en-GB"/>
         </w:rPr>
-        <w:t xml:space="preserve">, who run Killer Drives. New volunteers join you as you conquer bastions, and you can hire </w:t>
+        <w:t xml:space="preserve">, who run Killer Disks. New volunteers join you as you conquer bastions, and you can hire </w:t>
       </w:r>
       <w:r>
         <w:rPr>
@@ -257,7 +257,7 @@
         <w:rPr>
           <w:lang w:val="en-GB"/>
         </w:rPr>
-        <w:t xml:space="preserve">: one of your weapons hurts it more than the others. Once you hold Loreto or a higher place, the Tech Priests strike back and your places may rise against you; Hackers you leave behind as a </w:t>
+        <w:t xml:space="preserve">: one of your weapons hurts it more than the others. Once you hold Avila or a higher place, the Tech Priests strike back and your places may rise against you; Hackers you leave behind as a </w:t>
       </w:r>
       <w:r>
         <w:rPr>
@@ -336,7 +336,7 @@
         <w:rPr>
           <w:lang w:val="en-GB"/>
         </w:rPr>
-        <w:t xml:space="preserve"> with a RAM module (CE-151 or larger). The recording holds the program without its REM lines (5680 bytes); with its variables it needs about 5.9 KB of memory, so it does not fit into a PC-1500 or PC-2 without a module.</w:t>
+        <w:t xml:space="preserve"> with a RAM module (CE-151 or larger). The recording holds the program without its REM lines (5704 bytes); with its variables it needs about 5.9 KB of memory, so it does not fit into a PC-1500 or PC-2 without a module.</w:t>
       </w:r>
     </w:p>
     <w:p>
@@ -852,7 +852,7 @@
               <w:rPr>
                 <w:lang w:val="en-GB"/>
               </w:rPr>
-              <w:t xml:space="preserve">Buy Killer Drives, API keys, </w:t>
+              <w:t xml:space="preserve">Buy Killer Disks, API keys, </w:t>
             </w:r>
             <w:r>
               <w:rPr>
@@ -1087,7 +1087,7 @@
         <w:rPr>
           <w:lang w:val="en-GB"/>
         </w:rPr>
-        <w:t xml:space="preserve">Other keys are ignored. Numbers (the Killer Drives and API keys for a fight, the garrison, and what you buy or sell) are typed right after the question mark and confirmed with ENTER; any key other than a digit wipes the number, so you can type it again. A number that is too big gives a beep and the question again.</w:t>
+        <w:t xml:space="preserve">Other keys are ignored. Numbers (the Killer Disks and API keys for a fight, the garrison, and what you buy or sell) are typed right after the question mark and confirmed with ENTER; any key other than a digit wipes the number, so you can type it again. A number that is too big gives a beep and the question again.</w:t>
       </w:r>
     </w:p>
     <w:p>
@@ -1405,7 +1405,7 @@
               <w:keepNext/>
             </w:pPr>
             <w:r>
-              <w:t>Killer Drives</w:t>
+              <w:t>Killer Disks</w:t>
             </w:r>
           </w:p>
         </w:tc>
@@ -1775,7 +1775,7 @@
         <w:rPr>
           <w:lang w:val="en-GB"/>
         </w:rPr>
-        <w:t xml:space="preserve">(HACK on the display) run the Killer Drives: in every round each </w:t>
+        <w:t xml:space="preserve">(HACK on the display) run the Killer Disks: in every round each </w:t>
       </w:r>
       <w:r>
         <w:rPr>
@@ -1787,7 +1787,7 @@
         <w:rPr>
           <w:lang w:val="en-GB"/>
         </w:rPr>
-        <w:t xml:space="preserve"> runs one of the Killer Drives you chose for the fight, until all of them are used, so the more </w:t>
+        <w:t xml:space="preserve"> runs one of the Killer Disks you chose for the fight, until all of them are used, so the more </w:t>
       </w:r>
       <w:r>
         <w:rPr>
@@ -1799,7 +1799,7 @@
         <w:rPr>
           <w:lang w:val="en-GB"/>
         </w:rPr>
-        <w:t xml:space="preserve"> you have, the faster your drives strike. They also stand in the front line: the Tech Priests strike them first. Every conquered place gives you </w:t>
+        <w:t xml:space="preserve"> you have, the faster your disks strike. They also stand in the front line: the Tech Priests strike them first. Every conquered place gives you </w:t>
       </w:r>
       <w:proofErr w:type="spellStart"/>
       <w:r>
@@ -1851,7 +1851,7 @@
         <w:rPr>
           <w:lang w:val="en-GB"/>
         </w:rPr>
-        <w:t xml:space="preserve"> fight alone, without Killer Drives or API keys, in every fight, and stay with you until they are eliminated. They strike with a huge, carefully prepared Dependency Hell, which paralyses the Tech Priests’ systems and ends in crashes or a thermal infernal meltdown: a Guru who strikes eliminates 12 Tech Priests. Groups of Tech Priests hunt them, and a Guru who faces more than 10 Tech Priests at once may fall.</w:t>
+        <w:t xml:space="preserve"> fight alone, without Killer Disks or API keys, in every fight, and stay with you until they are eliminated. They strike with a huge, carefully prepared Dependency Hell, which paralyses the Tech Priests’ systems and ends in crashes or a thermal infernal meltdown: a Guru who strikes eliminates 12 Tech Priests. Groups of Tech Priests hunt them, and a Guru who faces more than 10 Tech Priests at once may fall.</w:t>
       </w:r>
     </w:p>
     <w:p>
@@ -1958,7 +1958,7 @@
         <w:rPr>
           <w:lang w:val="en-GB"/>
         </w:rPr>
-        <w:t xml:space="preserve"> is “eliminated”, the Tech Priests have defeated their solution, their code or their system: a patch closes the hole, a firewall swallows the worm, a Killer Drive is wiped clean. The defeated hero leaves the battlefield in one piece, for a long relaxation and a complete rewrite. Your people eliminate Tech Priests the same way: their systems crash, and they spend the rest of the war in the Cathodic Church’s retreat centre, waiting for the main spiritual help desk.</w:t>
+        <w:t xml:space="preserve"> is “eliminated”, the Tech Priests have defeated their solution, their code or their system: a patch closes the hole, a firewall swallows the worm, a Killer Disk is wiped clean. The defeated hero leaves the battlefield in one piece, for a long relaxation and a complete rewrite. Your people eliminate Tech Priests the same way: their systems crash, and they spend the rest of the war in the Cathodic Church’s retreat centre, waiting for the main spiritual help desk.</w:t>
       </w:r>
     </w:p>
     <w:p>
@@ -1984,76 +1984,28 @@
       <w:r>
         <w:rPr>
           <w:b/>
-          <w:bCs/>
-          <w:lang w:val="en-GB"/>
-        </w:rPr>
-        <w:t>Killer Drive:</w:t>
-      </w:r>
-      <w:r>
-        <w:rPr>
-          <w:lang w:val="en-GB"/>
-        </w:rPr>
-        <w:t xml:space="preserve"> a hard disk loaded with killer programs – </w:t>
-      </w:r>
-      <w:r>
-        <w:rPr>
-          <w:lang w:val="en-GB"/>
-        </w:rPr>
-        <w:t>malevolent system d</w:t>
-      </w:r>
-      <w:r>
-        <w:rPr>
-          <w:lang w:val="en-GB"/>
-        </w:rPr>
-        <w:t xml:space="preserve">aemons, merge conflicts, </w:t>
-      </w:r>
-      <w:r>
-        <w:rPr>
-          <w:lang w:val="en-GB"/>
-        </w:rPr>
-        <w:t>malicious</w:t>
-      </w:r>
-      <w:r>
-        <w:rPr>
-          <w:lang w:val="en-GB"/>
-        </w:rPr>
-        <w:t xml:space="preserve"> cod</w:t>
-      </w:r>
-      <w:r>
-        <w:rPr>
-          <w:lang w:val="en-GB"/>
-        </w:rPr>
-        <w:t>e</w:t>
-      </w:r>
-      <w:r>
-        <w:rPr>
-          <w:lang w:val="en-GB"/>
-        </w:rPr>
-        <w:t xml:space="preserve">, deadlocks and infinite loops – that drive the Tech Priests’ machines into an infernal overheat or a thermal meltdown, and the Tech Priests into panic. Only </w:t>
-      </w:r>
-      <w:r>
-        <w:rPr>
-          <w:lang w:val="en-GB"/>
-        </w:rPr>
-        <w:t>Hackers</w:t>
-      </w:r>
-      <w:r>
-        <w:rPr>
-          <w:lang w:val="en-GB"/>
-        </w:rPr>
-        <w:t xml:space="preserve"> can run Killer Drives, each </w:t>
-      </w:r>
-      <w:r>
-        <w:rPr>
-          <w:lang w:val="en-GB"/>
-        </w:rPr>
-        <w:t>Hacker</w:t>
-      </w:r>
-      <w:r>
-        <w:rPr>
-          <w:lang w:val="en-GB"/>
-        </w:rPr>
-        <w:t xml:space="preserve"> one drive per round. Every Killer Drive is used only once; a drive that hits eliminates one Tech Priest.</w:t>
+          <w:lang w:val="en-GB"/>
+        </w:rPr>
+        <w:t xml:space="preserve">Killer Disk</w:t>
+      </w:r>
+      <w:r>
+        <w:rPr>
+          <w:lang w:val="en-GB"/>
+        </w:rPr>
+        <w:t xml:space="preserve"> (</w:t>
+      </w:r>
+      <w:r>
+        <w:rPr>
+          <w:rFonts w:ascii="Courier New" w:eastAsia="Courier New" w:hAnsi="Courier New" w:cs="Courier New"/>
+          <w:lang w:val="en-GB"/>
+        </w:rPr>
+        <w:t xml:space="preserve">K-DISKS</w:t>
+      </w:r>
+      <w:r>
+        <w:rPr>
+          <w:lang w:val="en-GB"/>
+        </w:rPr>
+        <w:t xml:space="preserve"> on the display): a disk on which the Hackers prepare killer programs – malevolent system daemons, endless loops, merge conflicts, malicious code and deadlocks – that drive the Tech Priests’ machines into an infernal overheat or a thermal meltdown, and the Tech Priests into panic. Only Hackers can run Killer Disks, each Hacker one disk per round. Every Killer Disk is used only once; a disk that hits eliminates one Tech Priest.</w:t>
       </w:r>
     </w:p>
     <w:p>
@@ -2142,7 +2094,7 @@
         <w:rPr>
           <w:lang w:val="en-GB"/>
         </w:rPr>
-        <w:t xml:space="preserve">Not every attack succeeds. You choose how many Killer Drives and API keys to take into each fight. Each of them is used only once: in every round each </w:t>
+        <w:t xml:space="preserve">Not every attack succeeds. You choose how many Killer Disks and API keys to take into each fight. Each of them is used only once: in every round each </w:t>
       </w:r>
       <w:r>
         <w:rPr>
@@ -2154,7 +2106,7 @@
         <w:rPr>
           <w:lang w:val="en-GB"/>
         </w:rPr>
-        <w:t xml:space="preserve"> runs one Killer Drive and each </w:t>
+        <w:t xml:space="preserve"> runs one Killer Disk and each </w:t>
       </w:r>
       <w:r>
         <w:rPr>
@@ -2166,7 +2118,7 @@
         <w:rPr>
           <w:lang w:val="en-GB"/>
         </w:rPr>
-        <w:t xml:space="preserve"> uses one API key, as long as any are left. When you win, the Killer Drives and API keys that were not used come back to you.</w:t>
+        <w:t xml:space="preserve"> uses one API key, as long as any are left. When you win, the Killer Disks and API keys that were not used come back to you.</w:t>
       </w:r>
     </w:p>
     <w:p>
@@ -3781,7 +3733,7 @@
         <w:rPr>
           <w:lang w:val="en-GB"/>
         </w:rPr>
-        <w:t xml:space="preserve"> Every place is weak to one of your weapons: Killer Drives, API keys or Gurus. When you choose a place, the game shows it, e.g. </w:t>
+        <w:t xml:space="preserve"> Every place is weak to one of your weapons: Killer Disks, API keys or Gurus. When you choose a place, the game shows it, e.g. </w:t>
       </w:r>
       <w:r>
         <w:rPr>
@@ -3794,7 +3746,7 @@
         <w:rPr>
           <w:lang w:val="en-GB"/>
         </w:rPr>
-        <w:t xml:space="preserve">. There, the hits of that weapon count one and a half times. The weak spots follow the places in a fixed order – drives, keys, Gurus, drives, keys … – but where the order starts is drawn anew in every game: once you know the weak spot of one place, you know them all. Plan your purchases for the next places.</w:t>
+        <w:t xml:space="preserve">. There, the hits of that weapon count one and a half times. The weak spots follow the places in a fixed order – disks, keys, Gurus, disks, keys … – but where the order starts is drawn anew in every game: once you know the weak spot of one place, you know them all. Plan your purchases for the next places.</w:t>
       </w:r>
     </w:p>
     <w:p>
@@ -3936,7 +3888,7 @@
           <w:rFonts w:ascii="Courier New" w:eastAsia="Courier New" w:hAnsi="Courier New" w:cs="Courier New"/>
           <w:lang w:val="en-GB"/>
         </w:rPr>
-        <w:t xml:space="preserve">WEAK TO DRIVES</w:t>
+        <w:t xml:space="preserve">WEAK TO K-DISKS</w:t>
       </w:r>
       <w:r>
         <w:rPr>
@@ -3949,7 +3901,7 @@
           <w:rFonts w:ascii="Courier New" w:eastAsia="Courier New" w:hAnsi="Courier New" w:cs="Courier New"/>
           <w:lang w:val="en-GB"/>
         </w:rPr>
-        <w:t xml:space="preserve">DRIVES</w:t>
+        <w:t xml:space="preserve">K-DISKS</w:t>
       </w:r>
       <w:r>
         <w:rPr>
@@ -4014,7 +3966,7 @@
           <w:rFonts w:ascii="Courier New" w:eastAsia="Courier New" w:hAnsi="Courier New" w:cs="Courier New"/>
           <w:lang w:val="en-GB"/>
         </w:rPr>
-        <w:t xml:space="preserve">DRIVES (MAX 20) ?</w:t>
+        <w:t xml:space="preserve">K-DISKS (MAX 20) ?</w:t>
       </w:r>
       <w:r>
         <w:rPr>
@@ -4033,7 +3985,7 @@
         <w:rPr>
           <w:lang w:val="en-GB"/>
         </w:rPr>
-        <w:t xml:space="preserve">: the game shows how many you have. Type the number right after the question mark, as when buying, and press ENTER (ENTER alone: none). More than you have gives a beep and the question again. Without Killer Drives, API keys and Gurus you cannot fight: </w:t>
+        <w:t xml:space="preserve">: the game shows how many you have. Type the number right after the question mark, as when buying, and press ENTER (ENTER alone: none). More than you have gives a beep and the question again. Without Killer Disks, API keys and Gurus you cannot fight: </w:t>
       </w:r>
       <w:r>
         <w:rPr>
@@ -4072,7 +4024,7 @@
         <w:rPr>
           <w:lang w:val="en-GB"/>
         </w:rPr>
-        <w:t>: press 3 to retreat (you get your Killer Drives and API keys back) or ENTER to fight.</w:t>
+        <w:t>: press 3 to retreat (you get your Killer Disks and API keys back) or ENTER to fight.</w:t>
       </w:r>
     </w:p>
     <w:p>
@@ -4151,7 +4103,7 @@
         <w:rPr>
           <w:lang w:val="en-GB"/>
         </w:rPr>
-        <w:t xml:space="preserve">Your side strikes first: the Killer Drives your Hackers run (one per Hacker, while drives are left), the API keys your Ghosts use (one per Ghost, while keys are left) and all your Gurus. At the place’s weak spot, the hits of that weapon count one and a half times. The first strike is the weakest, because the Tech Priests are still behind their firewalls; from the second round on your attacks hit more often. However much you attack with, at most a third of the Tech Priests the place had at the start of the fight fall in one strike: the others take cover, and what was used on them is lost. So the Tech Priests are eliminated step by step, in three strikes or more.</w:t>
+        <w:t xml:space="preserve">Your side strikes first: the Killer Disks your Hackers run (one per Hacker, while disks are left), the API keys your Ghosts use (one per Ghost, while keys are left) and all your Gurus. At the place’s weak spot, the hits of that weapon count one and a half times. The first strike is the weakest, because the Tech Priests are still behind their firewalls; from the second round on your attacks hit more often. However much you attack with, at most a third of the Tech Priests the place had at the start of the fight fall in one strike: the others take cover, and what was used on them is lost. So the Tech Priests are eliminated step by step, in three strikes or more.</w:t>
       </w:r>
     </w:p>
     <w:p>
@@ -4170,7 +4122,7 @@
         <w:rPr>
           <w:lang w:val="en-GB"/>
         </w:rPr>
-        <w:t xml:space="preserve">Then the Tech Priests who are still active strike back. Your Hackers stand in the front line: the Tech Priests eliminate Hackers, and only when no Hackers are left they turn on the Ghosts. Groups of Tech Priests can also eliminate Gurus, and when after your Killer Drives and API keys more than 10 Tech Priests per Guru are left, each Guru may also fall.</w:t>
+        <w:t xml:space="preserve">Then the Tech Priests who are still active strike back. Your Hackers stand in the front line: the Tech Priests eliminate Hackers, and only when no Hackers are left they turn on the Ghosts. Groups of Tech Priests can also eliminate Gurus, and when after your Killer Disks and API keys more than 10 Tech Priests per Guru are left, each Guru may also fall.</w:t>
       </w:r>
     </w:p>
     <w:p>
@@ -4266,7 +4218,7 @@
         <w:rPr>
           <w:lang w:val="en-GB"/>
         </w:rPr>
-        <w:t xml:space="preserve"> run Killer Drives, the game shows </w:t>
+        <w:t xml:space="preserve"> run Killer Disks, the game shows </w:t>
       </w:r>
       <w:r>
         <w:rPr>
@@ -4280,7 +4232,7 @@
           <w:rFonts w:ascii="Courier New" w:eastAsia="Courier New" w:hAnsi="Courier New" w:cs="Courier New"/>
           <w:lang w:val="en-GB"/>
         </w:rPr>
-        <w:t xml:space="preserve"> launch Killer HDD!</w:t>
+        <w:t xml:space="preserve"> launch K-DISKS!</w:t>
       </w:r>
       <w:r>
         <w:rPr>
@@ -4364,7 +4316,7 @@
         <w:rPr>
           <w:lang w:val="en-GB"/>
         </w:rPr>
-        <w:t xml:space="preserve">Every Killer Drive and every API key is used only once. The fight goes on until no Tech Priests or none of your people are left; when all your Killer Drives and API keys have been used, only your </w:t>
+        <w:t xml:space="preserve">Every Killer Disk and every API key is used only once. The fight goes on until no Tech Priests or none of your people are left; when all your Killer Disks and API keys have been used, only your </w:t>
       </w:r>
       <w:r>
         <w:rPr>
@@ -4376,7 +4328,7 @@
         <w:rPr>
           <w:lang w:val="en-GB"/>
         </w:rPr>
-        <w:t>s strike. Once it has begun, a fight can only be stopped by surrendering (see Surrender below). When you win, the Killer Drives and API keys that were not used come back to you.</w:t>
+        <w:t>s strike. Once it has begun, a fight can only be stopped by surrendering (see Surrender below). When you win, the Killer Disks and API keys that were not used come back to you.</w:t>
       </w:r>
     </w:p>
     <w:p>
@@ -4449,7 +4401,7 @@
           <w:rFonts w:ascii="Courier New" w:eastAsia="Courier New" w:hAnsi="Courier New" w:cs="Courier New"/>
           <w:lang w:val="en-GB"/>
         </w:rPr>
-        <w:t>r RETRO c KILLER DRIVES</w:t>
+        <w:t>r RETRO c K-DISKS</w:t>
       </w:r>
     </w:p>
     <w:p>
@@ -4468,7 +4420,7 @@
         <w:rPr>
           <w:lang w:val="en-GB"/>
         </w:rPr>
-        <w:t>You got all the gold and all the retro stuff of the place, and some Killer Drives (more at the higher places), which the Tech Priests left behind!</w:t>
+        <w:t>You got all the gold and all the retro stuff of the place, and some Killer Disks (more at the higher places), which the Tech Priests left behind!</w:t>
       </w:r>
     </w:p>
     <w:p>
@@ -4865,7 +4817,7 @@
         <w:rPr>
           <w:lang w:val="en-GB"/>
         </w:rPr>
-        <w:t>You keep the people you still have and the Killer Drives and API keys that were not used; you get no gold, no retro stuff and no new people. The place stays with the CC, but only with the Tech Priests still active: the ones you have eliminated do not come back, so your next attack on that place is easier. When you have as many people as the Tech Priests or more, there is no (S): fight on!</w:t>
+        <w:t>You keep the people you still have and the Killer Disks and API keys that were not used; you get no gold, no retro stuff and no new people. The place stays with the CC, but only with the Tech Priests still active: the ones you have eliminated do not come back, so your next attack on that place is easier. When you have as many people as the Tech Priests or more, there is no (S): fight on!</w:t>
       </w:r>
     </w:p>
     <w:p>
@@ -4980,7 +4932,7 @@
         <w:rPr>
           <w:lang w:val="en-GB"/>
         </w:rPr>
-        <w:t xml:space="preserve">Once you have conquered Loreto (place 6) or a higher place, the Tech Priests start to fight back. From time to time, on the way back to the main menu, one of your places rises against you; it is never the place of your last fight. A garrison may hold it: every Hacker of the garrison holds off 20 of the Tech Priests the place had at the start of the game, so the chance is 20 × garrison ÷ Tech Priests, and a garrison of a twentieth of them always holds (Loreto: 10 Hackers, Valere: 30, Hohensalzburg: 49). Then the game shows e.g. </w:t>
+        <w:t xml:space="preserve">Once you have conquered Avila (place 5) or a higher place, the Tech Priests start to fight back. From time to time, on the way back to the main menu, one of your places rises against you; it is never the place of your last fight. A garrison may hold it: every Hacker of the garrison holds off 20 of the Tech Priests the place had at the start of the game, so the chance is 20 × garrison ÷ Tech Priests, and a garrison of a twentieth of them always holds (Loreto: 10 Hackers, Valere: 30, Hohensalzburg: 49). Then the game shows e.g. </w:t>
       </w:r>
       <w:r>
         <w:rPr>
@@ -5056,7 +5008,7 @@
           <w:rFonts w:ascii="Courier New" w:eastAsia="Courier New" w:hAnsi="Courier New" w:cs="Courier New"/>
           <w:lang w:val="en-GB"/>
         </w:rPr>
-        <w:t>D)RIVE A)PI G)URU H)ACKER</w:t>
+        <w:t>D)ISK A)PI G)URU H)ACKER</w:t>
       </w:r>
       <w:r>
         <w:rPr>
@@ -5233,7 +5185,7 @@
               <w:keepNext/>
             </w:pPr>
             <w:r>
-              <w:t>Killer Drive</w:t>
+              <w:t>Killer Disk</w:t>
             </w:r>
           </w:p>
         </w:tc>
@@ -5846,7 +5798,7 @@
               <w:jc w:val="right"/>
             </w:pPr>
             <w:r>
-              <w:t>random</w:t>
+              <w:t>750 at the start</w:t>
             </w:r>
           </w:p>
         </w:tc>
@@ -6063,38 +6015,14 @@
         <w:rPr>
           <w:lang w:val="en-GB"/>
         </w:rPr>
-        <w:t xml:space="preserve">The price of retro stuff is random. It stays the same until your next fight and then changes. </w:t>
-      </w:r>
-      <w:r>
-        <w:rPr>
-          <w:lang w:val="en-GB"/>
-        </w:rPr>
-        <w:t>Hackers</w:t>
-      </w:r>
-      <w:r>
-        <w:rPr>
-          <w:lang w:val="en-GB"/>
-        </w:rPr>
-        <w:t xml:space="preserve"> and </w:t>
-      </w:r>
-      <w:r>
-        <w:rPr>
-          <w:lang w:val="en-GB"/>
-        </w:rPr>
-        <w:t>Guru</w:t>
-      </w:r>
-      <w:r>
-        <w:rPr>
-          <w:lang w:val="en-GB"/>
-        </w:rPr>
-        <w:t xml:space="preserve">s sell for less than they cost. You cannot sell your last people: the game shows </w:t>
-      </w:r>
-      <w:r>
-        <w:rPr>
-          <w:rFonts w:ascii="Courier New" w:eastAsia="Courier New" w:hAnsi="Courier New" w:cs="Courier New"/>
-          <w:lang w:val="en-GB"/>
-        </w:rPr>
-        <w:t>KEEP SOMEONE!</w:t>
+        <w:t xml:space="preserve">The price of retro stuff is 750 gold at the start of the game. After every fight it rises by 0, 50, 100, 150 or 200 gold (at random); every sale of retro stuff lowers it by 0 to 200 gold, but never below 250. Hackers and Gurus sell for less than they cost. You cannot sell your last people: the game shows </w:t>
+      </w:r>
+      <w:r>
+        <w:rPr>
+          <w:rFonts w:ascii="Courier New" w:eastAsia="Courier New" w:hAnsi="Courier New" w:cs="Courier New"/>
+          <w:lang w:val="en-GB"/>
+        </w:rPr>
+        <w:t xml:space="preserve">KEEP SOMEONE!</w:t>
       </w:r>
       <w:r>
         <w:rPr>
@@ -6107,13 +6035,13 @@
           <w:rFonts w:ascii="Courier New" w:eastAsia="Courier New" w:hAnsi="Courier New" w:cs="Courier New"/>
           <w:lang w:val="en-GB"/>
         </w:rPr>
-        <w:t>NOTHING TO SELL</w:t>
-      </w:r>
-      <w:r>
-        <w:rPr>
-          <w:lang w:val="en-GB"/>
-        </w:rPr>
-        <w:t>.</w:t>
+        <w:t xml:space="preserve">NOTHING TO SELL</w:t>
+      </w:r>
+      <w:r>
+        <w:rPr>
+          <w:lang w:val="en-GB"/>
+        </w:rPr>
+        <w:t xml:space="preserve">.</w:t>
       </w:r>
     </w:p>
     <w:p>
@@ -6161,7 +6089,7 @@
           <w:rFonts w:ascii="Courier New" w:eastAsia="Courier New" w:hAnsi="Courier New" w:cs="Courier New"/>
           <w:lang w:val="en-GB"/>
         </w:rPr>
-        <w:t xml:space="preserve">KILLER DRIVES n</w:t>
+        <w:t xml:space="preserve">K-DISKS n</w:t>
       </w:r>
       <w:r>
         <w:rPr>
@@ -6428,7 +6356,7 @@
         <w:rPr>
           <w:lang w:val="en-GB"/>
         </w:rPr>
-        <w:t xml:space="preserve">Every element counts. Killer Drives are the cheapest, but only your Hackers can run them, one each per round; API keys need Ghosts, one each per round; Gurus need nobody and fight again in every round and every fight. Every Killer Drive and API key is used only once, and at most a third of the Tech Priests fall in one strike: when you have more Ghosts than API keys, all your keys are used in the first round, while the Tech Priests are still behind their firewalls. A player who leaves out any of Killer Drives, API keys, Gurus, Hackers or Ghosts wins clearly less often.</w:t>
+        <w:t xml:space="preserve">Every element counts. Killer Disks are the cheapest, but only your Hackers can run them, one each per round; API keys need Ghosts, one each per round; Gurus need nobody and fight again in every round and every fight. Every Killer Disk and API key is used only once, and at most a third of the Tech Priests fall in one strike: when you have more Ghosts than API keys, all your keys are used in the first round, while the Tech Priests are still behind their firewalls. A player who leaves out any of Killer Disks, API keys, Gurus, Hackers or Ghosts wins clearly less often.</w:t>
       </w:r>
     </w:p>
     <w:p>
@@ -6447,7 +6375,7 @@
         <w:rPr>
           <w:lang w:val="en-GB"/>
         </w:rPr>
-        <w:t>Your income is the gold and the retro stuff of the conquered places. Sell retro stuff when the price is good; if it is low, keep it: the price changes after your next fight.</w:t>
+        <w:t xml:space="preserve">Your income is the gold and the retro stuff of the conquered places. Retro stuff gains value with every fight and loses some with every sale: keep it while you can, and when you sell, sell a lot at once.</w:t>
       </w:r>
     </w:p>
     <w:p>
@@ -6486,7 +6414,7 @@
         <w:rPr>
           <w:lang w:val="en-GB"/>
         </w:rPr>
-        <w:t xml:space="preserve">Gurus are expensive and mighty, and they fight again in every following fight – but they are no miracle workers. Do not let them be outnumbered: when more than 10 Tech Priests per Guru are left after your Killer Drives and API keys, they fall fast.</w:t>
+        <w:t xml:space="preserve">Gurus are expensive and mighty, and they fight again in every following fight – but they are no miracle workers. Do not let them be outnumbered: when more than 10 Tech Priests per Guru are left after your Killer Disks and API keys, they fall fast.</w:t>
       </w:r>
     </w:p>
     <w:p>
@@ -6616,7 +6544,7 @@
         <w:rPr>
           <w:lang w:val="en-GB"/>
         </w:rPr>
-        <w:t xml:space="preserve"> you sell is one fewer to run Killer Drives and to take the Tech Priests’ blows.</w:t>
+        <w:t xml:space="preserve"> you sell is one fewer to run Killer Disks and to take the Tech Priests’ blows.</w:t>
       </w:r>
     </w:p>
     <w:p>
@@ -6647,7 +6575,7 @@
         <w:rPr>
           <w:lang w:val="en-GB"/>
         </w:rPr>
-        <w:t xml:space="preserve"> you win are your reserve of people and of drive-runners. Check your forces with R and the places with L before you attack.</w:t>
+        <w:t xml:space="preserve"> you win are your reserve of people and of disk-runners. Check your forces with R and the places with L before you attack.</w:t>
       </w:r>
     </w:p>
     <w:p>
@@ -6699,7 +6627,7 @@
         <w:rPr>
           <w:lang w:val="en-GB"/>
         </w:rPr>
-        <w:t>A lost fight ends the game. When a fight goes badly, press S in time (from the second round, while you have fewer people than the Tech Priests): you keep your people and your unused drives and keys, and the Tech Priests you have eliminated are gone for good. Then buy what you need and attack the same place again.</w:t>
+        <w:t>A lost fight ends the game. When a fight goes badly, press S in time (from the second round, while you have fewer people than the Tech Priests): you keep your people and your unused disks and keys, and the Tech Priests you have eliminated are gone for good. Then buy what you need and attack the same place again.</w:t>
       </w:r>
     </w:p>
     <w:sectPr>

</xml_diff>

<commit_message>
v2.1: less retro stuff per place (INT(3.2N)+1) for the walking retro price
With the new retro price (750, +0-200 after a fight, -0-200 after a sale)
the planning bot won 97.5% of the games: retro stuff is the main income.
Retro stuff per place 4N+5 -> INT(3.2N)+1 (1, 4, 7 ... 29) brings it back
to 70% (model, 120 games); without gurus 38%, disks 45%, keys 58%,
hackers 1%, ghosts 34%; simple rule and spenders 0%.
Program 5716 bytes; new recording, instructions table.

Co-Authored-By: Claude Opus 5.5 <noreply@anthropic.com>
Claude-Session: https://claude.ai/code/session_014MnrG7cc1Hws3poqmcDFnM
</commit_message>
<xml_diff>
--- a/instructions_v2.1.docx
+++ b/instructions_v2.1.docx
@@ -336,7 +336,7 @@
         <w:rPr>
           <w:lang w:val="en-GB"/>
         </w:rPr>
-        <w:t xml:space="preserve"> with a RAM module (CE-151 or larger). The recording holds the program without its REM lines (5704 bytes); with its variables it needs about 5.9 KB of memory, so it does not fit into a PC-1500 or PC-2 without a module.</w:t>
+        <w:t xml:space="preserve"> with a RAM module (CE-151 or larger). The recording holds the program without its REM lines (5716 bytes); with its variables it needs about 5.9 KB of memory, so it does not fit into a PC-1500 or PC-2 without a module.</w:t>
       </w:r>
     </w:p>
     <w:p>
@@ -2432,7 +2432,7 @@
               <w:jc w:val="right"/>
             </w:pPr>
             <w:r>
-              <w:t>5</w:t>
+              <w:t>1</w:t>
             </w:r>
           </w:p>
         </w:tc>
@@ -2565,7 +2565,7 @@
               <w:jc w:val="right"/>
             </w:pPr>
             <w:r>
-              <w:t>9</w:t>
+              <w:t>4</w:t>
             </w:r>
           </w:p>
         </w:tc>
@@ -2698,7 +2698,7 @@
               <w:jc w:val="right"/>
             </w:pPr>
             <w:r>
-              <w:t>13</w:t>
+              <w:t>7</w:t>
             </w:r>
           </w:p>
         </w:tc>
@@ -2831,7 +2831,7 @@
               <w:jc w:val="right"/>
             </w:pPr>
             <w:r>
-              <w:t>17</w:t>
+              <w:t>10</w:t>
             </w:r>
           </w:p>
         </w:tc>
@@ -2964,7 +2964,7 @@
               <w:jc w:val="right"/>
             </w:pPr>
             <w:r>
-              <w:t>21</w:t>
+              <w:t>13</w:t>
             </w:r>
           </w:p>
         </w:tc>
@@ -3097,7 +3097,7 @@
               <w:jc w:val="right"/>
             </w:pPr>
             <w:r>
-              <w:t>25</w:t>
+              <w:t>17</w:t>
             </w:r>
           </w:p>
         </w:tc>
@@ -3230,7 +3230,7 @@
               <w:jc w:val="right"/>
             </w:pPr>
             <w:r>
-              <w:t>29</w:t>
+              <w:t>20</w:t>
             </w:r>
           </w:p>
         </w:tc>
@@ -3367,7 +3367,7 @@
               <w:jc w:val="right"/>
             </w:pPr>
             <w:r>
-              <w:t>33</w:t>
+              <w:t>23</w:t>
             </w:r>
           </w:p>
         </w:tc>
@@ -3505,7 +3505,7 @@
               <w:jc w:val="right"/>
             </w:pPr>
             <w:r>
-              <w:t>37</w:t>
+              <w:t>26</w:t>
             </w:r>
           </w:p>
         </w:tc>
@@ -3663,7 +3663,7 @@
               <w:rPr>
                 <w:color w:val="EE0000"/>
               </w:rPr>
-              <w:t>41</w:t>
+              <w:t>29</w:t>
             </w:r>
           </w:p>
         </w:tc>
@@ -3875,7 +3875,7 @@
           <w:rFonts w:ascii="Courier New" w:eastAsia="Courier New" w:hAnsi="Courier New" w:cs="Courier New"/>
           <w:lang w:val="en-GB"/>
         </w:rPr>
-        <w:t xml:space="preserve">17 RETRO STUFF, 900 GOLD</w:t>
+        <w:t xml:space="preserve">10 RETRO STUFF, 900 GOLD</w:t>
       </w:r>
       <w:r>
         <w:rPr>

</xml_diff>

<commit_message>
v2.1: level retro price (600, +0-100 per fight, -0-250 per sale), retro 4N+5 again
The retro price used to rise through the game (750 -> about 1150 with the
planning bot). Steps chosen so that it stays level on average: +0..2 x 50
after every fight, -0..5 x 50 after every sale of retro stuff (>= 250); the
start price 600 sets the difficulty, so retro stuff per place is 4N+5 again.
Model (120 games): full 76.7-77.5% (v2.0 in the same model 86.7%), without
gurus 47.5, disks 52.5, keys 65, hackers 3.3, ghosts 46.7; rule/spenders 0%.
Program 5704 bytes; new recording, instructions, README.

Co-Authored-By: Claude Opus 5.5 <noreply@anthropic.com>
Claude-Session: https://claude.ai/code/session_014MnrG7cc1Hws3poqmcDFnM
</commit_message>
<xml_diff>
--- a/instructions_v2.1.docx
+++ b/instructions_v2.1.docx
@@ -336,7 +336,7 @@
         <w:rPr>
           <w:lang w:val="en-GB"/>
         </w:rPr>
-        <w:t xml:space="preserve"> with a RAM module (CE-151 or larger). The recording holds the program without its REM lines (5716 bytes); with its variables it needs about 5.9 KB of memory, so it does not fit into a PC-1500 or PC-2 without a module.</w:t>
+        <w:t xml:space="preserve"> with a RAM module (CE-151 or larger). The recording holds the program without its REM lines (5704 bytes); with its variables it needs about 5.9 KB of memory, so it does not fit into a PC-1500 or PC-2 without a module.</w:t>
       </w:r>
     </w:p>
     <w:p>
@@ -2432,7 +2432,7 @@
               <w:jc w:val="right"/>
             </w:pPr>
             <w:r>
-              <w:t>1</w:t>
+              <w:t>5</w:t>
             </w:r>
           </w:p>
         </w:tc>
@@ -2565,7 +2565,7 @@
               <w:jc w:val="right"/>
             </w:pPr>
             <w:r>
-              <w:t>4</w:t>
+              <w:t>9</w:t>
             </w:r>
           </w:p>
         </w:tc>
@@ -2698,7 +2698,7 @@
               <w:jc w:val="right"/>
             </w:pPr>
             <w:r>
-              <w:t>7</w:t>
+              <w:t>13</w:t>
             </w:r>
           </w:p>
         </w:tc>
@@ -2831,7 +2831,7 @@
               <w:jc w:val="right"/>
             </w:pPr>
             <w:r>
-              <w:t>10</w:t>
+              <w:t>17</w:t>
             </w:r>
           </w:p>
         </w:tc>
@@ -2964,7 +2964,7 @@
               <w:jc w:val="right"/>
             </w:pPr>
             <w:r>
-              <w:t>13</w:t>
+              <w:t>21</w:t>
             </w:r>
           </w:p>
         </w:tc>
@@ -3097,7 +3097,7 @@
               <w:jc w:val="right"/>
             </w:pPr>
             <w:r>
-              <w:t>17</w:t>
+              <w:t>25</w:t>
             </w:r>
           </w:p>
         </w:tc>
@@ -3230,7 +3230,7 @@
               <w:jc w:val="right"/>
             </w:pPr>
             <w:r>
-              <w:t>20</w:t>
+              <w:t>29</w:t>
             </w:r>
           </w:p>
         </w:tc>
@@ -3367,7 +3367,7 @@
               <w:jc w:val="right"/>
             </w:pPr>
             <w:r>
-              <w:t>23</w:t>
+              <w:t>33</w:t>
             </w:r>
           </w:p>
         </w:tc>
@@ -3505,7 +3505,7 @@
               <w:jc w:val="right"/>
             </w:pPr>
             <w:r>
-              <w:t>26</w:t>
+              <w:t>37</w:t>
             </w:r>
           </w:p>
         </w:tc>
@@ -3663,7 +3663,7 @@
               <w:rPr>
                 <w:color w:val="EE0000"/>
               </w:rPr>
-              <w:t>29</w:t>
+              <w:t>41</w:t>
             </w:r>
           </w:p>
         </w:tc>
@@ -3875,7 +3875,7 @@
           <w:rFonts w:ascii="Courier New" w:eastAsia="Courier New" w:hAnsi="Courier New" w:cs="Courier New"/>
           <w:lang w:val="en-GB"/>
         </w:rPr>
-        <w:t xml:space="preserve">10 RETRO STUFF, 900 GOLD</w:t>
+        <w:t xml:space="preserve">17 RETRO STUFF, 900 GOLD</w:t>
       </w:r>
       <w:r>
         <w:rPr>
@@ -5798,7 +5798,7 @@
               <w:jc w:val="right"/>
             </w:pPr>
             <w:r>
-              <w:t>750 at the start</w:t>
+              <w:t>600 at the start</w:t>
             </w:r>
           </w:p>
         </w:tc>
@@ -6015,7 +6015,7 @@
         <w:rPr>
           <w:lang w:val="en-GB"/>
         </w:rPr>
-        <w:t xml:space="preserve">The price of retro stuff is 750 gold at the start of the game. After every fight it rises by 0, 50, 100, 150 or 200 gold (at random); every sale of retro stuff lowers it by 0 to 200 gold, but never below 250. Hackers and Gurus sell for less than they cost. You cannot sell your last people: the game shows </w:t>
+        <w:t xml:space="preserve">The price of retro stuff is 600 gold at the start of the game. After every fight it rises by 0, 50 or 100 gold (at random); every sale of retro stuff lowers it by 0 to 250 gold, but never below 250. On average over a game the price stays level: whoever sells often pushes it down, whoever waits sees it rise. Hackers and Gurus sell for less than they cost. You cannot sell your last people: the game shows </w:t>
       </w:r>
       <w:r>
         <w:rPr>

</xml_diff>

<commit_message>
v2.1: garrisons that pay off, NO HACKERS/GHOSTS LEFT!, CC vs YOU with S
- A place that rises comes back with three times its Tech Priests; every
  garrison Hacker holds off 40 of them (Loreto 5, Valere 15,
  Hohensalzburg 25 always hold).
- Winning back a place that broke free gives a fifth of its gold and
  retro stuff (no more farming by re-conquest).
- Retro stuff starts at 650 gold.
- Fight messages NO HACKERS LEFT! and NO GHOSTS LEFT!; round screen
  ROUND3:CC 120 vs YOU 45 with S at the right end for surrender.
- E then Y ends the game at once (any other key: back to the menu).
- L$(0)*26 instead of LS$(0)*32; 5714 bytes, new recording.
- Instructions: how your forces are used in a fight, new rules; README.

Co-Authored-By: Claude Opus 5.5 <noreply@anthropic.com>
Claude-Session: https://claude.ai/code/session_014MnrG7cc1Hws3poqmcDFnM
</commit_message>
<xml_diff>
--- a/instructions_v2.1.docx
+++ b/instructions_v2.1.docx
@@ -336,7 +336,7 @@
         <w:rPr>
           <w:lang w:val="en-GB"/>
         </w:rPr>
-        <w:t xml:space="preserve"> with a RAM module (CE-151 or larger). The recording holds the program without its REM lines (5704 bytes); with its variables it needs about 5.9 KB of memory, so it does not fit into a PC-1500 or PC-2 without a module.</w:t>
+        <w:t xml:space="preserve"> with a RAM module (CE-151 or larger). The recording holds the program without its REM lines (5714 bytes); with its variables it needs about 5.9 KB of memory, so it does not fit into a PC-1500 or PC-2 without a module.</w:t>
       </w:r>
     </w:p>
     <w:p>
@@ -3933,7 +3933,7 @@
         <w:rPr>
           <w:lang w:val="en-GB"/>
         </w:rPr>
-        <w:t xml:space="preserve">). A place that you have conquered before and that broke free gives only half its gold; the screen already shows the halved amount. If the place is already yours, the game shows e.g. </w:t>
+        <w:t xml:space="preserve">). A place that you have conquered before and that broke free gives only a fifth of its gold and of its retro stuff; the screen already shows the reduced amounts. If the place is already yours, the game shows e.g. </w:t>
       </w:r>
       <w:r>
         <w:rPr>
@@ -4148,7 +4148,7 @@
           <w:rFonts w:ascii="Courier New" w:eastAsia="Courier New" w:hAnsi="Courier New" w:cs="Courier New"/>
           <w:lang w:val="en-GB"/>
         </w:rPr>
-        <w:t>ROUND1:CC m YOU p</w:t>
+        <w:t xml:space="preserve">ROUND1:CC m vs YOU p</w:t>
       </w:r>
       <w:r>
         <w:rPr>
@@ -4161,7 +4161,7 @@
           <w:rFonts w:ascii="Courier New" w:eastAsia="Courier New" w:hAnsi="Courier New" w:cs="Courier New"/>
           <w:lang w:val="en-GB"/>
         </w:rPr>
-        <w:t>ROUND2</w:t>
+        <w:t xml:space="preserve">ROUND2</w:t>
       </w:r>
       <w:r>
         <w:rPr>
@@ -4174,7 +4174,7 @@
           <w:rFonts w:ascii="Courier New" w:eastAsia="Courier New" w:hAnsi="Courier New" w:cs="Courier New"/>
           <w:lang w:val="en-GB"/>
         </w:rPr>
-        <w:t>ROUND3</w:t>
+        <w:t xml:space="preserve">ROUND3</w:t>
       </w:r>
       <w:r>
         <w:rPr>
@@ -4187,7 +4187,7 @@
           <w:rFonts w:ascii="Courier New" w:eastAsia="Courier New" w:hAnsi="Courier New" w:cs="Courier New"/>
           <w:lang w:val="en-GB"/>
         </w:rPr>
-        <w:t>CC 0</w:t>
+        <w:t xml:space="preserve">CC 0</w:t>
       </w:r>
       <w:r>
         <w:rPr>
@@ -4200,109 +4200,78 @@
           <w:rFonts w:ascii="Courier New" w:eastAsia="Courier New" w:hAnsi="Courier New" w:cs="Courier New"/>
           <w:lang w:val="en-GB"/>
         </w:rPr>
-        <w:t>YOU 0</w:t>
-      </w:r>
-      <w:r>
-        <w:rPr>
-          <w:lang w:val="en-GB"/>
-        </w:rPr>
-        <w:t xml:space="preserve"> when you lose. After every strike in which your </w:t>
-      </w:r>
-      <w:r>
-        <w:rPr>
-          <w:lang w:val="en-GB"/>
-        </w:rPr>
-        <w:t>Hackers</w:t>
-      </w:r>
-      <w:r>
-        <w:rPr>
-          <w:lang w:val="en-GB"/>
-        </w:rPr>
-        <w:t xml:space="preserve"> run Killer Disks, the game shows </w:t>
-      </w:r>
-      <w:r>
-        <w:rPr>
-          <w:rFonts w:ascii="Courier New" w:eastAsia="Courier New" w:hAnsi="Courier New" w:cs="Courier New"/>
-          <w:lang w:val="en-GB"/>
-        </w:rPr>
-        <w:t>Hackers</w:t>
-      </w:r>
-      <w:r>
-        <w:rPr>
-          <w:rFonts w:ascii="Courier New" w:eastAsia="Courier New" w:hAnsi="Courier New" w:cs="Courier New"/>
-          <w:lang w:val="en-GB"/>
-        </w:rPr>
-        <w:t xml:space="preserve"> launch K-DISKS!</w:t>
-      </w:r>
-      <w:r>
-        <w:rPr>
-          <w:lang w:val="en-GB"/>
-        </w:rPr>
-        <w:t xml:space="preserve">, after every strike in which your </w:t>
-      </w:r>
-      <w:r>
-        <w:rPr>
-          <w:lang w:val="en-GB"/>
-        </w:rPr>
-        <w:t>Ghost</w:t>
-      </w:r>
-      <w:r>
-        <w:rPr>
-          <w:lang w:val="en-GB"/>
-        </w:rPr>
-        <w:t xml:space="preserve">s use API keys, it shows </w:t>
-      </w:r>
-      <w:r>
-        <w:rPr>
-          <w:rFonts w:ascii="Courier New" w:eastAsia="Courier New" w:hAnsi="Courier New" w:cs="Courier New"/>
-          <w:lang w:val="en-GB"/>
-        </w:rPr>
-        <w:t>Ghost</w:t>
-      </w:r>
-      <w:r>
-        <w:rPr>
-          <w:rFonts w:ascii="Courier New" w:eastAsia="Courier New" w:hAnsi="Courier New" w:cs="Courier New"/>
-          <w:lang w:val="en-GB"/>
-        </w:rPr>
-        <w:t>s cast worms plague!</w:t>
-      </w:r>
-      <w:r>
-        <w:rPr>
-          <w:lang w:val="en-GB"/>
-        </w:rPr>
-        <w:t xml:space="preserve">, and after every strike in which your </w:t>
-      </w:r>
-      <w:r>
-        <w:rPr>
-          <w:lang w:val="en-GB"/>
-        </w:rPr>
-        <w:t>Guru</w:t>
-      </w:r>
-      <w:r>
-        <w:rPr>
-          <w:lang w:val="en-GB"/>
-        </w:rPr>
-        <w:t xml:space="preserve">s attack, it shows </w:t>
-      </w:r>
-      <w:r>
-        <w:rPr>
-          <w:rFonts w:ascii="Courier New" w:eastAsia="Courier New" w:hAnsi="Courier New" w:cs="Courier New"/>
-          <w:lang w:val="en-GB"/>
-        </w:rPr>
-        <w:t>Guru</w:t>
-      </w:r>
-      <w:r>
-        <w:rPr>
-          <w:rFonts w:ascii="Courier New" w:eastAsia="Courier New" w:hAnsi="Courier New" w:cs="Courier New"/>
-          <w:lang w:val="en-GB"/>
-        </w:rPr>
-        <w:t>s set Dependency Hell</w:t>
-      </w:r>
-      <w:r>
-        <w:rPr>
-          <w:lang w:val="en-GB"/>
-        </w:rPr>
-        <w:t>, before the next round. Each of these messages comes with the last three notes of the second phrase of Bach’s Toccata, and before every new screen of a round the display goes blank for a moment, so that you see each change.</w:t>
+        <w:t xml:space="preserve">YOU 0</w:t>
+      </w:r>
+      <w:r>
+        <w:rPr>
+          <w:lang w:val="en-GB"/>
+        </w:rPr>
+        <w:t xml:space="preserve"> when you lose. After every strike in which your Hackers run Killer Disks, the game shows </w:t>
+      </w:r>
+      <w:r>
+        <w:rPr>
+          <w:rFonts w:ascii="Courier New" w:eastAsia="Courier New" w:hAnsi="Courier New" w:cs="Courier New"/>
+          <w:lang w:val="en-GB"/>
+        </w:rPr>
+        <w:t xml:space="preserve">Hackers launch K-DISKS!</w:t>
+      </w:r>
+      <w:r>
+        <w:rPr>
+          <w:lang w:val="en-GB"/>
+        </w:rPr>
+        <w:t xml:space="preserve">, after every strike in which your Ghosts use API keys, it shows </w:t>
+      </w:r>
+      <w:r>
+        <w:rPr>
+          <w:rFonts w:ascii="Courier New" w:eastAsia="Courier New" w:hAnsi="Courier New" w:cs="Courier New"/>
+          <w:lang w:val="en-GB"/>
+        </w:rPr>
+        <w:t xml:space="preserve">Ghosts cast worms plague!</w:t>
+      </w:r>
+      <w:r>
+        <w:rPr>
+          <w:lang w:val="en-GB"/>
+        </w:rPr>
+        <w:t xml:space="preserve">, and after every strike in which your Gurus attack, it shows </w:t>
+      </w:r>
+      <w:r>
+        <w:rPr>
+          <w:rFonts w:ascii="Courier New" w:eastAsia="Courier New" w:hAnsi="Courier New" w:cs="Courier New"/>
+          <w:lang w:val="en-GB"/>
+        </w:rPr>
+        <w:t xml:space="preserve">Gurus set Dependency Hell</w:t>
+      </w:r>
+      <w:r>
+        <w:rPr>
+          <w:lang w:val="en-GB"/>
+        </w:rPr>
+        <w:t xml:space="preserve">, before the next round. Each of these messages comes with the last three notes of the second phrase of Bach’s Toccata. When the Tech Priests’ blows eliminate your last Hackers, the game shows </w:t>
+      </w:r>
+      <w:r>
+        <w:rPr>
+          <w:rFonts w:ascii="Courier New" w:eastAsia="Courier New" w:hAnsi="Courier New" w:cs="Courier New"/>
+          <w:lang w:val="en-GB"/>
+        </w:rPr>
+        <w:t xml:space="preserve">NO HACKERS LEFT!</w:t>
+      </w:r>
+      <w:r>
+        <w:rPr>
+          <w:lang w:val="en-GB"/>
+        </w:rPr>
+        <w:t xml:space="preserve">, and when they eliminate your last Ghosts, </w:t>
+      </w:r>
+      <w:r>
+        <w:rPr>
+          <w:rFonts w:ascii="Courier New" w:eastAsia="Courier New" w:hAnsi="Courier New" w:cs="Courier New"/>
+          <w:lang w:val="en-GB"/>
+        </w:rPr>
+        <w:t xml:space="preserve">NO GHOSTS LEFT!</w:t>
+      </w:r>
+      <w:r>
+        <w:rPr>
+          <w:lang w:val="en-GB"/>
+        </w:rPr>
+        <w:t xml:space="preserve">. Before every new screen of a round the display goes blank for a moment, so that you see each change.</w:t>
       </w:r>
     </w:p>
     <w:p>
@@ -4314,21 +4283,42 @@
       </w:pPr>
       <w:r>
         <w:rPr>
-          <w:lang w:val="en-GB"/>
-        </w:rPr>
-        <w:t xml:space="preserve">Every Killer Disk and every API key is used only once. The fight goes on until no Tech Priests or none of your people are left; when all your Killer Disks and API keys have been used, only your </w:t>
-      </w:r>
-      <w:r>
-        <w:rPr>
-          <w:lang w:val="en-GB"/>
-        </w:rPr>
-        <w:t>Guru</w:t>
-      </w:r>
-      <w:r>
-        <w:rPr>
-          <w:lang w:val="en-GB"/>
-        </w:rPr>
-        <w:t>s strike. Once it has begun, a fight can only be stopped by surrendering (see Surrender below). When you win, the Killer Disks and API keys that were not used come back to you.</w:t>
+          <w:b/>
+          <w:lang w:val="en-GB"/>
+        </w:rPr>
+        <w:t xml:space="preserve">How your forces are used.</w:t>
+      </w:r>
+      <w:r>
+        <w:rPr>
+          <w:lang w:val="en-GB"/>
+        </w:rPr>
+        <w:t xml:space="preserve"> In the first round each of your Hackers runs one of the Killer Disks you took and each Ghost uses one API key: if you took no more of them than you have Hackers and Ghosts, they are all used at once, in the weakest strike. Every disk and key is used only once. The Tech Priests strike your Hackers first, and in most fights the last of them fall in the first round or two: </w:t>
+      </w:r>
+      <w:r>
+        <w:rPr>
+          <w:rFonts w:ascii="Courier New" w:eastAsia="Courier New" w:hAnsi="Courier New" w:cs="Courier New"/>
+          <w:lang w:val="en-GB"/>
+        </w:rPr>
+        <w:t xml:space="preserve">NO HACKERS LEFT!</w:t>
+      </w:r>
+      <w:r>
+        <w:rPr>
+          <w:lang w:val="en-GB"/>
+        </w:rPr>
+        <w:t xml:space="preserve">, and the disks still in the fight are not used any more. Then your Ghosts are hit; after </w:t>
+      </w:r>
+      <w:r>
+        <w:rPr>
+          <w:rFonts w:ascii="Courier New" w:eastAsia="Courier New" w:hAnsi="Courier New" w:cs="Courier New"/>
+          <w:lang w:val="en-GB"/>
+        </w:rPr>
+        <w:t xml:space="preserve">NO GHOSTS LEFT!</w:t>
+      </w:r>
+      <w:r>
+        <w:rPr>
+          <w:lang w:val="en-GB"/>
+        </w:rPr>
+        <w:t xml:space="preserve"> the keys left lie idle too, and only your Gurus fight on. The fight goes on until no Tech Priests or none of your people are left; once it has begun, only surrendering stops it (see Surrender below). Disks and keys that were not used come back to you when you win or surrender.</w:t>
       </w:r>
     </w:p>
     <w:p>
@@ -4420,7 +4410,7 @@
         <w:rPr>
           <w:lang w:val="en-GB"/>
         </w:rPr>
-        <w:t>You got all the gold and all the retro stuff of the place, and some Killer Disks (more at the higher places), which the Tech Priests left behind!</w:t>
+        <w:t xml:space="preserve">You got all the gold and all the retro stuff of the place (only a fifth of them when you win back a place that broke free), and some Killer Disks (more at the higher places), which the Tech Priests left behind!</w:t>
       </w:r>
     </w:p>
     <w:p>
@@ -4728,7 +4718,7 @@
           <w:rFonts w:ascii="Courier New" w:eastAsia="Courier New" w:hAnsi="Courier New" w:cs="Courier New"/>
           <w:lang w:val="en-GB"/>
         </w:rPr>
-        <w:t>(S)</w:t>
+        <w:t xml:space="preserve">S</w:t>
       </w:r>
       <w:r>
         <w:rPr>
@@ -4741,7 +4731,7 @@
           <w:rFonts w:ascii="Courier New" w:eastAsia="Courier New" w:hAnsi="Courier New" w:cs="Courier New"/>
           <w:lang w:val="en-GB"/>
         </w:rPr>
-        <w:t xml:space="preserve">ROUND3:CC 120 YOU 45   ⁠(S)</w:t>
+        <w:t xml:space="preserve">ROUND3:CC 120 vs YOU 45  S</w:t>
       </w:r>
       <w:r>
         <w:rPr>
@@ -4754,7 +4744,7 @@
           <w:rFonts w:ascii="Courier New" w:eastAsia="Courier New" w:hAnsi="Courier New" w:cs="Courier New"/>
           <w:lang w:val="en-GB"/>
         </w:rPr>
-        <w:t>YOU SURRENDERED!</w:t>
+        <w:t xml:space="preserve">YOU SURRENDERED!</w:t>
       </w:r>
       <w:r>
         <w:rPr>
@@ -4762,7 +4752,6 @@
         </w:rPr>
         <w:t xml:space="preserve"> appears in the middle of the display while the falling melody plays, and blinks three times; then your losses in this fight are shown, </w:t>
       </w:r>
-      <w:proofErr w:type="spellStart"/>
       <w:r>
         <w:rPr>
           <w:rFonts w:ascii="Courier New" w:eastAsia="Courier New" w:hAnsi="Courier New" w:cs="Courier New"/>
@@ -4770,40 +4759,11 @@
         </w:rPr>
         <w:t xml:space="preserve">LOST:mH sG jU</w:t>
       </w:r>
-      <w:proofErr w:type="spellEnd"/>
-      <w:r>
-        <w:rPr>
-          <w:rFonts w:ascii="Courier New" w:eastAsia="Courier New" w:hAnsi="Courier New" w:cs="Courier New"/>
-          <w:lang w:val="en-GB"/>
-        </w:rPr>
-        <w:t xml:space="preserve"/>
-      </w:r>
-      <w:r>
-        <w:rPr>
-          <w:rFonts w:ascii="Courier New" w:eastAsia="Courier New" w:hAnsi="Courier New" w:cs="Courier New"/>
-          <w:lang w:val="en-GB"/>
-        </w:rPr>
-        <w:t xml:space="preserve"/>
-      </w:r>
-      <w:r>
-        <w:rPr>
-          <w:rFonts w:ascii="Courier New" w:eastAsia="Courier New" w:hAnsi="Courier New" w:cs="Courier New"/>
-          <w:lang w:val="en-GB"/>
-        </w:rPr>
-        <w:t xml:space="preserve"/>
-      </w:r>
-      <w:r>
-        <w:rPr>
-          <w:rFonts w:ascii="Courier New" w:eastAsia="Courier New" w:hAnsi="Courier New" w:cs="Courier New"/>
-          <w:lang w:val="en-GB"/>
-        </w:rPr>
-        <w:t xml:space="preserve"/>
-      </w:r>
-      <w:r>
-        <w:rPr>
-          <w:lang w:val="en-GB"/>
-        </w:rPr>
-        <w:t>, and the main menu comes back.</w:t>
+      <w:r>
+        <w:rPr>
+          <w:lang w:val="en-GB"/>
+        </w:rPr>
+        <w:t xml:space="preserve">, and the main menu comes back.</w:t>
       </w:r>
     </w:p>
     <w:p>
@@ -4817,7 +4777,7 @@
         <w:rPr>
           <w:lang w:val="en-GB"/>
         </w:rPr>
-        <w:t>You keep the people you still have and the Killer Disks and API keys that were not used; you get no gold, no retro stuff and no new people. The place stays with the CC, but only with the Tech Priests still active: the ones you have eliminated do not come back, so your next attack on that place is easier. When you have as many people as the Tech Priests or more, there is no (S): fight on!</w:t>
+        <w:t>You keep the people you still have and the Killer Disks and API keys that were not used; you get no gold, no retro stuff and no new people. The place stays with the CC, but only with the Tech Priests still active: the ones you have eliminated do not come back, so your next attack on that place is easier. When you have as many people as the Tech Priests or more, there is no S: fight on!</w:t>
       </w:r>
     </w:p>
     <w:p>
@@ -4932,7 +4892,7 @@
         <w:rPr>
           <w:lang w:val="en-GB"/>
         </w:rPr>
-        <w:t xml:space="preserve">Once you have conquered Avila (place 5) or a higher place, the Tech Priests start to fight back. From time to time, on the way back to the main menu, one of your places rises against you; it is never the place of your last fight. A garrison may hold it: every Hacker of the garrison holds off 20 of the Tech Priests the place had at the start of the game, so the chance is 20 × garrison ÷ Tech Priests, and a garrison of a twentieth of them always holds (Loreto: 10 Hackers, Valere: 30, Hohensalzburg: 49). Then the game shows e.g. </w:t>
+        <w:t xml:space="preserve">Once you have conquered Avila (place 5) or a higher place, the Tech Priests start to fight back. From time to time, on the way back to the main menu, one of your places rises against you; it is never the place of your last fight. A garrison may hold it: every Hacker of the garrison holds off 40 of the Tech Priests the place had at the start of the game, so the chance is 40 × garrison ÷ Tech Priests, and a garrison of a fortieth of them always holds (Lourdes, Fatima, Altotting: 1 Hacker; Santiago de C., Jasna Gora: 2; Avila: 3; Loreto: 5; Valere: 15; Hohensalzburg: 25). Then the game shows e.g. </w:t>
       </w:r>
       <w:r>
         <w:rPr>
@@ -4966,13 +4926,13 @@
           <w:rFonts w:ascii="Courier New" w:eastAsia="Courier New" w:hAnsi="Courier New" w:cs="Courier New"/>
           <w:lang w:val="en-GB"/>
         </w:rPr>
-        <w:t xml:space="preserve">Loreto broke free!</w:t>
-      </w:r>
-      <w:r>
-        <w:rPr>
-          <w:lang w:val="en-GB"/>
-        </w:rPr>
-        <w:t xml:space="preserve"> while the music plays, then the main menu comes back. The garrison is lost, and the CC sends twice as many Tech Priests as the place had at the start of the game. Its retro stuff is back, but winning it back gives only half its gold and no treasure. To win the war, all ten places must be yours at the same time.</w:t>
+        <w:t xml:space="preserve">Loreto broke free!</w:t>
+      </w:r>
+      <w:r>
+        <w:rPr>
+          <w:lang w:val="en-GB"/>
+        </w:rPr>
+        <w:t xml:space="preserve"> while the music plays, then the main menu comes back. The garrison is lost, and the CC sends three times as many Tech Priests as the place had at the start of the game. Winning it back gives only a fifth of its gold and of its retro stuff, and no treasure: a place that breaks free is always a loss. To win the war, all ten places must be yours at the same time.</w:t>
       </w:r>
     </w:p>
     <w:p>
@@ -5798,7 +5758,7 @@
               <w:jc w:val="right"/>
             </w:pPr>
             <w:r>
-              <w:t>600 at the start</w:t>
+              <w:t>650 at the start</w:t>
             </w:r>
           </w:p>
         </w:tc>
@@ -6015,7 +5975,7 @@
         <w:rPr>
           <w:lang w:val="en-GB"/>
         </w:rPr>
-        <w:t xml:space="preserve">The price of retro stuff is 600 gold at the start of the game. After every fight it rises by 0, 50 or 100 gold (at random); every sale of retro stuff lowers it by 0 to 250 gold, but never below 250. On average over a game the price stays level: whoever sells often pushes it down, whoever waits sees it rise. Hackers and Gurus sell for less than they cost. You cannot sell your last people: the game shows </w:t>
+        <w:t xml:space="preserve">The price of retro stuff is 650 gold at the start of the game. After every fight it rises by 0, 50 or 100 gold (at random); every sale of retro stuff lowers it by 0 to 250 gold, but never below 250. On average over a game the price stays level: whoever sells often pushes it down, whoever waits sees it rise. Hackers and Gurus sell for less than they cost. You cannot sell your last people: the game shows </w:t>
       </w:r>
       <w:r>
         <w:rPr>
@@ -6201,61 +6161,7 @@
         <w:rPr>
           <w:lang w:val="en-GB"/>
         </w:rPr>
-        <w:t xml:space="preserve">Press </w:t>
-      </w:r>
-      <w:r>
-        <w:rPr>
-          <w:b/>
-          <w:bCs/>
-          <w:lang w:val="en-GB"/>
-        </w:rPr>
-        <w:t>E</w:t>
-      </w:r>
-      <w:r>
-        <w:rPr>
-          <w:lang w:val="en-GB"/>
-        </w:rPr>
-        <w:t xml:space="preserve">. </w:t>
-      </w:r>
-      <w:r>
-        <w:rPr>
-          <w:rFonts w:ascii="Courier New" w:eastAsia="Courier New" w:hAnsi="Courier New" w:cs="Courier New"/>
-          <w:lang w:val="en-GB"/>
-        </w:rPr>
-        <w:t>QUIT (Y/N)?</w:t>
-      </w:r>
-      <w:r>
-        <w:rPr>
-          <w:lang w:val="en-GB"/>
-        </w:rPr>
-        <w:t xml:space="preserve">: </w:t>
-      </w:r>
-      <w:r>
-        <w:rPr>
-          <w:b/>
-          <w:bCs/>
-          <w:lang w:val="en-GB"/>
-        </w:rPr>
-        <w:t>Y</w:t>
-      </w:r>
-      <w:r>
-        <w:rPr>
-          <w:lang w:val="en-GB"/>
-        </w:rPr>
-        <w:t xml:space="preserve"> ends the game and shows your gold (</w:t>
-      </w:r>
-      <w:r>
-        <w:rPr>
-          <w:rFonts w:ascii="Courier New" w:eastAsia="Courier New" w:hAnsi="Courier New" w:cs="Courier New"/>
-          <w:lang w:val="en-GB"/>
-        </w:rPr>
-        <w:t>BYE! GOLD g</w:t>
-      </w:r>
-      <w:r>
-        <w:rPr>
-          <w:lang w:val="en-GB"/>
-        </w:rPr>
-        <w:t>); any other key returns to the main menu.</w:t>
+        <w:t xml:space="preserve">Press E and then Y: the game ends at once, without a message. Any other key instead of Y keeps the game going: the main menu is still on the display, so just press the key you want.</w:t>
       </w:r>
     </w:p>
     <w:p>
@@ -6356,7 +6262,7 @@
         <w:rPr>
           <w:lang w:val="en-GB"/>
         </w:rPr>
-        <w:t xml:space="preserve">Every element counts. Killer Disks are the cheapest, but only your Hackers can run them, one each per round; API keys need Ghosts, one each per round; Gurus need nobody and fight again in every round and every fight. Every Killer Disk and API key is used only once, and at most a third of the Tech Priests fall in one strike: when you have more Ghosts than API keys, all your keys are used in the first round, while the Tech Priests are still behind their firewalls. A player who leaves out any of Killer Disks, API keys, Gurus, Hackers or Ghosts wins clearly less often.</w:t>
+        <w:t xml:space="preserve">Every element counts. Killer Disks are the cheapest, but only your Hackers can run them, one each per round; API keys need Ghosts, one each per round; Gurus need nobody and fight again in every round and every fight. Every Killer Disk and API key is used only once, and at most a third of the Tech Priests fall in one strike: when you have more Ghosts than API keys, all your keys are used in the first round, while the Tech Priests are still behind their firewalls. A player who leaves out any of Killer Disks, API keys, Gurus, Hackers, Ghosts or garrisons wins clearly less often.</w:t>
       </w:r>
     </w:p>
     <w:p>
@@ -6452,7 +6358,7 @@
         <w:rPr>
           <w:lang w:val="en-GB"/>
         </w:rPr>
-        <w:t xml:space="preserve">Garrisons cost Hackers for good, so do not guard everything: a small place is cheap to win back. Guard the places you can least afford to lose – a rich place that breaks free comes back with twice as many Tech Priests. A half garrison holds half the time.</w:t>
+        <w:t xml:space="preserve">Garrisons cost Hackers for good, but a few are enough: one Hacker holds off 40 Tech Priests. A place that breaks free comes back with three times as many Tech Priests and gives only a fifth of its gold and retro stuff when you win it back, so guard the bigger places you hold. The first, small places are cheap to win back; a half garrison holds half the time.</w:t>
       </w:r>
     </w:p>
     <w:p>

</xml_diff>

<commit_message>
New title illustration: UNLEASH SYSTEM DAEMONS? (README, instructions)
Co-Authored-By: Claude Opus 5.5 <noreply@anthropic.com>
Claude-Session: https://claude.ai/code/session_014MnrG7cc1Hws3poqmcDFnM
</commit_message>
<xml_diff>
--- a/instructions_v2.1.docx
+++ b/instructions_v2.1.docx
@@ -72,9 +72,9 @@
         </w:rPr>
         <w:drawing>
           <wp:inline distT="0" distB="0" distL="0" distR="0" wp14:anchorId="1D649030" wp14:editId="35FC4E8A">
-            <wp:extent cx="6120130" cy="3418666"/>
+            <wp:extent cx="6120130" cy="3675754"/>
             <wp:effectExtent l="0" t="0" r="0" b="0"/>
-            <wp:docPr id="1" name="Title illustration" descr="Hooded Tech Priests among retro computers in a gothic church; a Sharp PC-1500A shows: Gurus created Dependency HELL!!!"/>
+            <wp:docPr id="1" name="Title illustration" descr="Hooded Tech Priests in despair among retro computers in a gothic church; a Sharp PC-1500 shows: UNLEASH SYSTEM DAEMONS?"/>
             <wp:cNvGraphicFramePr>
               <a:graphicFrameLocks xmlns:a="http://schemas.openxmlformats.org/drawingml/2006/main" noChangeAspect="1"/>
             </wp:cNvGraphicFramePr>
@@ -94,7 +94,7 @@
                   <pic:spPr>
                     <a:xfrm>
                       <a:off x="0" y="0"/>
-                      <a:ext cx="6120130" cy="3418666"/>
+                      <a:ext cx="6120130" cy="3675754"/>
                     </a:xfrm>
                     <a:prstGeom prst="rect">
                       <a:avLst/>

</xml_diff>